<commit_message>
WC/2024/227: Registry letter — offer to file the notices, responses and documents; will proceed on the Commissioner's orders
Co-Authored-By: Claude Fable 5.1 <noreply@anthropic.com>
Claude-Session: https://claude.ai/code/session_01PbSZiMB1koFR46V5hQyVcy
</commit_message>
<xml_diff>
--- a/wc2024227/drafts/second-amended-9A/2026-10_LETTER_to_Registry_leave_to_amend_and_documents.docx
+++ b/wc2024227/drafts/second-amended-9A/2026-10_LETTER_to_Registry_leave_to_amend_and_documents.docx
@@ -202,6 +202,26 @@
           <w:b/>
           <w:sz w:val="20"/>
         </w:rPr>
+        <w:t xml:space="preserve">The record. </w:t>
+      </w:r>
+      <w:r>
+        <w:rPr>
+          <w:rFonts w:ascii="Arial" w:hAnsi="Arial"/>
+          <w:sz w:val="20"/>
+        </w:rPr>
+        <w:t xml:space="preserve">The notice to admit facts (303 facts), the notice to admit documents (39 documents at Annexure A) and the Respondent's responses of 8 September 2026 were served between the parties and are not on the Commission's file. If the Commission wishes to consider them with the enclosure, the Appellant will file them in the form the Registry directs, together with the four documents the Respondent confirmed on 23 September 2026. The Appellant will proceed on whatever orders and directions the Commissioner gives on this application, on the documents, and on the further conduct of the appeal.</w:t>
+      </w:r>
+    </w:p>
+    <w:p>
+      <w:pPr>
+        <w:spacing w:after="100"/>
+      </w:pPr>
+      <w:r>
+        <w:rPr>
+          <w:rFonts w:ascii="Arial" w:hAnsi="Arial"/>
+          <w:b/>
+          <w:sz w:val="20"/>
+        </w:rPr>
         <w:t xml:space="preserve">Where the Appellant stands. </w:t>
       </w:r>
       <w:r>
@@ -241,7 +261,7 @@
           <w:rFonts w:ascii="Arial" w:hAnsi="Arial"/>
           <w:sz w:val="20"/>
         </w:rPr>
-        <w:t xml:space="preserve">The Appellant asks that this letter be placed before Commissioner Dwyer.</w:t>
+        <w:t xml:space="preserve">The Appellant asks that this letter and its enclosure be placed before Commissioner Dwyer, and will proceed on the orders the Commissioner makes.</w:t>
       </w:r>
     </w:p>
     <w:p>

</xml_diff>

<commit_message>
WC/2024/227: Registry letter fitted to one page plus schedule
Co-Authored-By: Claude Fable 5.1 <noreply@anthropic.com>
Claude-Session: https://claude.ai/code/session_01PbSZiMB1koFR46V5hQyVcy
</commit_message>
<xml_diff>
--- a/wc2024227/drafts/second-amended-9A/2026-10_LETTER_to_Registry_leave_to_amend_and_documents.docx
+++ b/wc2024227/drafts/second-amended-9A/2026-10_LETTER_to_Registry_leave_to_amend_and_documents.docx
@@ -149,7 +149,7 @@
           <w:rFonts w:ascii="Arial" w:hAnsi="Arial"/>
           <w:sz w:val="20"/>
         </w:rPr>
-        <w:t xml:space="preserve">The Appellant applies for leave to file and serve the enclosed Second Amended Statement of Facts and Contentions (Form 9A), under the Commission's power to give directions (Industrial Relations Act 2016, section 451(2)). The Respondent has been sent a copy with this letter and asked to consent. The amendment withdraws the characterisations in the Amended Form 9A filed 7 April 2026; accepts that the onus is the Appellant's; confines each stressor to the facts admitted by the Respondent on 8 September 2026 and to the documents behind them; and adds no new allegation. No hearing date has been set.</w:t>
+        <w:t xml:space="preserve">The Appellant applies for leave to file and serve the enclosed Second Amended Statement of Facts and Contentions (Form 9A), under the Commission's power to give directions (Industrial Relations Act 2016, section 451(2)). The Respondent has been sent a copy and asked to consent. The amendment withdraws the characterisations in the Amended Form 9A filed 7 April 2026; accepts that the onus is the Appellant's; confines each stressor to the facts admitted by the Respondent on 8 September 2026 and to the documents behind them; and adds no new allegation. No hearing date has been set.</w:t>
       </w:r>
     </w:p>
     <w:p>
@@ -169,7 +169,7 @@
           <w:rFonts w:ascii="Arial" w:hAnsi="Arial"/>
           <w:sz w:val="20"/>
         </w:rPr>
-        <w:t xml:space="preserve">The Respondent admitted 298 of the 303 facts in the Appellant's notice to admit facts of 28 August 2026. The enclosed pleading sets those facts out under the stressor each proves, with the paragraph number of the admission against each, so that the whole of the Appellant's case can be read in one document. Each stressor is pleaded so that it can be decided on its own; where a fact bears on more than one it is repeated, and the pleading says so. Part B.7 lists every document relied upon and its status; Part C states the contentions; Part D the questions for determination.</w:t>
+        <w:t xml:space="preserve">The Respondent admitted 298 of the 303 facts in the Appellant's notice to admit facts of 28 August 2026. The enclosed pleading sets those facts out under the stressor each proves, with the paragraph number of the admission against each, so that the whole case can be read in one document. Each stressor is pleaded so that it can be decided on its own; where a fact bears on more than one it is repeated, and the pleading says so. Part B.7 lists every document relied upon and its status; Part C states the contentions; Part D the questions for determination.</w:t>
       </w:r>
     </w:p>
     <w:p>
@@ -189,7 +189,7 @@
           <w:rFonts w:ascii="Arial" w:hAnsi="Arial"/>
           <w:sz w:val="20"/>
         </w:rPr>
-        <w:t xml:space="preserve">The Appellant was an Administration Officer (AO3) on the Logan Hospital Switchboard, a continuous 24/7 role whose function the Respondent admits is critical to patient safety (facts 2, 13, 289). Stressor 1: from July 2023 database access was removed and not restored (40, 55), process changes were made effective the day they were notified without any listed record of consultation (51, 181, 273), calls were misdirected and the directory was not corrected (56 to 69, 89 to 110), and the manager's office hours were not stated for nine months (71 to 73); the Appellant's written request for them was met with a request to retract (74 to 77). Stressor 2: pay was wrong in four fortnights (185 to 189); Payroll's direction of 3 May 2024 was not actioned at 13 May (193), was still awaited on 21 May (195), and was lodged on 28 May and recorded "Part Completed" (203); a paid leave entitlement was declined twice on attachments the Respondent admits were present (116, 118, 134). Stressor 3: a seven-hour break was rostered between 17 and 18 March 2024 (284) against a minimum of ten hours or eight by written agreement (285), an agreement the employer's Human Resources says applied only to staff-initiated swaps, none being alleged (225, 234); the fatigue enquiry was answered after 23 days with a refusal (247, 249); no fatigue risk management existed at the Switchboard before 30 June 2024 (264, 269 to 271); and the Respondent's own review found the rostering was unreasonable management action (260) and employment a significant contributing factor (262). The Respondent's statement of facts and contentions identifies no management action relied upon for section 32(5) (303), and its outlines of evidence served 24 September 2026 notify no medical or expert evidence.</w:t>
+        <w:t xml:space="preserve">The Appellant was an Administration Officer (AO3) on the Logan Hospital Switchboard, a continuous 24/7 role whose function the Respondent admits is critical to patient safety (2, 13, 289). Stressor 1: from July 2023 database access was removed and not restored (40, 55), process changes were made effective the day they were notified without any listed record of consultation (51, 181, 273), calls were misdirected and the directory was not corrected (56 to 69, 89 to 110), and the manager's office hours were not stated for nine months (71 to 73); the Appellant's written request for them was met with a request to retract (74 to 77). Stressor 2: pay was wrong in four fortnights (185 to 189); Payroll's direction of 3 May 2024 was not actioned at 13 May (193), was still awaited on 21 May (195), and was lodged on 28 May and recorded "Part Completed" (203); a paid leave entitlement was declined twice on attachments the Respondent admits were present (116, 118, 134). Stressor 3: a seven-hour break was rostered between 17 and 18 March 2024 (284) against a minimum of ten hours or eight by written agreement (285), an agreement the employer's Human Resources says applied only to staff-initiated swaps, none being alleged (225, 234); the fatigue enquiry was answered after 23 days with a refusal (247, 249); no fatigue risk management existed at the Switchboard before 30 June 2024 (264, 269 to 271); and the Respondent's own review found the rostering was unreasonable management action (260) and employment a significant contributing factor (262). The Respondent's statement of facts and contentions identifies no management action relied upon for section 32(5) (303), and its outlines of evidence served 24 September 2026 notify no medical or expert evidence.</w:t>
       </w:r>
     </w:p>
     <w:p>

</xml_diff>

<commit_message>
WC/2024/227: Registry letter — the amendment explained (onus accepted; matter crystallised by the admissions and documents; record available on request)
Co-Authored-By: Claude Fable 5.1 <noreply@anthropic.com>
Claude-Session: https://claude.ai/code/session_01PbSZiMB1koFR46V5hQyVcy
</commit_message>
<xml_diff>
--- a/wc2024227/drafts/second-amended-9A/2026-10_LETTER_to_Registry_leave_to_amend_and_documents.docx
+++ b/wc2024227/drafts/second-amended-9A/2026-10_LETTER_to_Registry_leave_to_amend_and_documents.docx
@@ -142,14 +142,14 @@
           <w:b/>
           <w:sz w:val="20"/>
         </w:rPr>
-        <w:t xml:space="preserve">The application. </w:t>
-      </w:r>
-      <w:r>
-        <w:rPr>
-          <w:rFonts w:ascii="Arial" w:hAnsi="Arial"/>
-          <w:sz w:val="20"/>
-        </w:rPr>
-        <w:t xml:space="preserve">The Appellant applies for leave to file and serve the enclosed Second Amended Statement of Facts and Contentions (Form 9A), under the Commission's power to give directions (Industrial Relations Act 2016, section 451(2)). The Respondent has been sent a copy and asked to consent. The amendment withdraws the characterisations in the Amended Form 9A filed 7 April 2026; accepts that the onus is the Appellant's; confines each stressor to the facts admitted by the Respondent on 8 September 2026 and to the documents behind them; and adds no new allegation. No hearing date has been set.</w:t>
+        <w:t xml:space="preserve">The application, and what the amendment does. </w:t>
+      </w:r>
+      <w:r>
+        <w:rPr>
+          <w:rFonts w:ascii="Arial" w:hAnsi="Arial"/>
+          <w:sz w:val="20"/>
+        </w:rPr>
+        <w:t xml:space="preserve">The Appellant applies for leave to file and serve the enclosed Second Amended Statement of Facts and Contentions (Form 9A), under the Commission's power to give directions (Industrial Relations Act 2016, section 451(2)). The Respondent has been sent a copy and asked to consent. The amendment is made because the matter has crystallised since the Amended Form 9A of 7 April 2026: the Respondent admitted 298 of the 303 facts in the Appellant's notice of 28 August 2026, admitted or has since confirmed 29 of the 39 documents behind them, served its outlines of evidence on 24 September 2026, and has notified no medical or expert evidence. The Second Amended Form 9A accepts that the onus of proof is the Appellant's, withdraws the characterisations in the earlier pleading, confines each stressor to the admitted facts and the documents that record them, states the contentions and the questions for determination on that footing, and adds no new allegation. No hearing date has been set.</w:t>
       </w:r>
     </w:p>
     <w:p>
@@ -169,7 +169,7 @@
           <w:rFonts w:ascii="Arial" w:hAnsi="Arial"/>
           <w:sz w:val="20"/>
         </w:rPr>
-        <w:t xml:space="preserve">The Respondent admitted 298 of the 303 facts in the Appellant's notice to admit facts of 28 August 2026. The enclosed pleading sets those facts out under the stressor each proves, with the paragraph number of the admission against each, so that the whole case can be read in one document. Each stressor is pleaded so that it can be decided on its own; where a fact bears on more than one it is repeated, and the pleading says so. Part B.7 lists every document relied upon and its status; Part C states the contentions; Part D the questions for determination.</w:t>
+        <w:t xml:space="preserve">The enclosed pleading sets the admitted facts out under the stressor each proves, with the paragraph number of the admission against each, so that the whole case can be read in one document. Each stressor is pleaded so that it can be decided on its own; where a fact bears on more than one it is repeated, and the pleading says so. Part B.7 lists every document relied upon and its status; Part C states the contentions; Part D the questions for determination.</w:t>
       </w:r>
     </w:p>
     <w:p>
@@ -202,14 +202,14 @@
           <w:b/>
           <w:sz w:val="20"/>
         </w:rPr>
-        <w:t xml:space="preserve">The record. </w:t>
-      </w:r>
-      <w:r>
-        <w:rPr>
-          <w:rFonts w:ascii="Arial" w:hAnsi="Arial"/>
-          <w:sz w:val="20"/>
-        </w:rPr>
-        <w:t xml:space="preserve">The notice to admit facts (303 facts), the notice to admit documents (39 documents at Annexure A) and the Respondent's responses of 8 September 2026 were served between the parties and are not on the Commission's file. If the Commission wishes to consider them with the enclosure, the Appellant will file them in the form the Registry directs, together with the four documents the Respondent confirmed on 23 September 2026. The Appellant will proceed on whatever orders and directions the Commissioner gives on this application, on the documents, and on the further conduct of the appeal.</w:t>
+        <w:t xml:space="preserve">The record, available on request. </w:t>
+      </w:r>
+      <w:r>
+        <w:rPr>
+          <w:rFonts w:ascii="Arial" w:hAnsi="Arial"/>
+          <w:sz w:val="20"/>
+        </w:rPr>
+        <w:t xml:space="preserve">The notice to admit facts (303 facts), the notice to admit documents (39 documents at Annexure A) and the Respondent's responses of 8 September 2026 were served between the parties and are not on the Commission's file. They, and the documents themselves, are available to the Commission on request: if the Commission wishes to consider them with the enclosure, the Appellant will file them in the form the Registry directs, together with the four documents the Respondent confirmed on 23 September 2026. The Appellant will proceed on whatever orders and directions the Commissioner gives on this application, on the documents, and on the further conduct of the appeal.</w:t>
       </w:r>
     </w:p>
     <w:p>

</xml_diff>

<commit_message>
WC/2024/227: Registry letter — single signature line
Co-Authored-By: Claude Fable 5.1 <noreply@anthropic.com>
Claude-Session: https://claude.ai/code/session_01PbSZiMB1koFR46V5hQyVcy
</commit_message>
<xml_diff>
--- a/wc2024227/drafts/second-amended-9A/2026-10_LETTER_to_Registry_leave_to_amend_and_documents.docx
+++ b/wc2024227/drafts/second-amended-9A/2026-10_LETTER_to_Registry_leave_to_amend_and_documents.docx
@@ -273,19 +273,7 @@
           <w:rFonts w:ascii="Arial" w:hAnsi="Arial"/>
           <w:sz w:val="20"/>
         </w:rPr>
-        <w:t xml:space="preserve">Cory Lea Shepherd</w:t>
-      </w:r>
-    </w:p>
-    <w:p>
-      <w:pPr>
-        <w:spacing w:after="100"/>
-      </w:pPr>
-      <w:r>
-        <w:rPr>
-          <w:rFonts w:ascii="Arial" w:hAnsi="Arial"/>
-          <w:sz w:val="20"/>
-        </w:rPr>
-        <w:t xml:space="preserve">Appellant, self-represented</w:t>
+        <w:t xml:space="preserve">Cory Lea Shepherd, Appellant (self-represented)</w:t>
       </w:r>
     </w:p>
     <w:p>

</xml_diff>